<commit_message>
docs(de-cuong): bo muc 9.2 rui ro va phuong an du phong
Bo tron muc 9.2 gom doan dan, Bang 8 va doan ket.

Keo theo ba viec:

- Muc 9 gio chi con mot noi dung nen bo luon tieu de con "9.1. Tien do theo
  tuan"; muc 9 thanh muc phang nhu muc 5, 7, 8.
- Tieu de muc 9 di thang vao chu thich bang thi doc cut, trong khi moi muc
  khac deu co mot cau dan truoc bang. Them mot cau.
- Bo hai dong 9.1 va 9.2 khoi muc luc.

Bang 8 la bang cuoi nen khong phai danh so lai; chu thich bang van lien tuc
tu Bang 1 den Bang 7. Khong muc nao khac trong de cuong dan chieu toi muc 9.2
hay Bang 8, da kiem.

De cuong 17 -> 16 trang, muc luc tu 27 xuong 25 muc. Da do lai so trang tren
ban xuat va doi chieu 25/25 muc khop. Bo doi chieu so luong: 9/9 phat bieu
con lai van khop.

Co-Authored-By: Claude Opus 5 <noreply@anthropic.com>
Claude-Session: https://claude.ai/code/session_01AEgUuwxWZb75UPoWigF6iK
</commit_message>
<xml_diff>
--- a/thesis/doc/de-cuong-do-an.docx
+++ b/thesis/doc/de-cuong-do-an.docx
@@ -922,56 +922,26 @@
           <w:tab w:pos="8957" w:val="right" w:leader="dot"/>
         </w:tabs>
         <w:spacing w:lineRule="auto" w:line="276" w:before="20" w:after="20"/>
-        <w:ind w:left="454"/>
         <w:jc w:val="left"/>
       </w:pPr>
       <w:r>
         <w:rPr>
           <w:rFonts w:ascii="Times New Roman" w:hAnsi="Times New Roman" w:cs="Times New Roman" w:eastAsia="Times New Roman"/>
-          <w:b w:val="0"/>
+          <w:b/>
           <w:i w:val="0"/>
           <w:sz w:val="26"/>
         </w:rPr>
-        <w:t>9.1. Tiến độ theo tuần</w:t>
-      </w:r>
-      <w:r>
-        <w:rPr>
-          <w:rFonts w:ascii="Times New Roman" w:hAnsi="Times New Roman" w:cs="Times New Roman" w:eastAsia="Times New Roman"/>
-          <w:b w:val="0"/>
+        <w:t>10. TÀI LIỆU THAM KHẢO DỰ KIẾN</w:t>
+      </w:r>
+      <w:r>
+        <w:rPr>
+          <w:rFonts w:ascii="Times New Roman" w:hAnsi="Times New Roman" w:cs="Times New Roman" w:eastAsia="Times New Roman"/>
+          <w:b/>
           <w:i w:val="0"/>
           <w:sz w:val="26"/>
         </w:rPr>
         <w:tab/>
-        <w:t>13</w:t>
-      </w:r>
-    </w:p>
-    <w:p>
-      <w:pPr>
-        <w:tabs>
-          <w:tab w:pos="8957" w:val="right" w:leader="dot"/>
-        </w:tabs>
-        <w:spacing w:lineRule="auto" w:line="276" w:before="20" w:after="20"/>
-        <w:ind w:left="454"/>
-        <w:jc w:val="left"/>
-      </w:pPr>
-      <w:r>
-        <w:rPr>
-          <w:rFonts w:ascii="Times New Roman" w:hAnsi="Times New Roman" w:cs="Times New Roman" w:eastAsia="Times New Roman"/>
-          <w:b w:val="0"/>
-          <w:i w:val="0"/>
-          <w:sz w:val="26"/>
-        </w:rPr>
-        <w:t>9.2. Rủi ro và phương án dự phòng</w:t>
-      </w:r>
-      <w:r>
-        <w:rPr>
-          <w:rFonts w:ascii="Times New Roman" w:hAnsi="Times New Roman" w:cs="Times New Roman" w:eastAsia="Times New Roman"/>
-          <w:b w:val="0"/>
-          <w:i w:val="0"/>
-          <w:sz w:val="26"/>
-        </w:rPr>
-        <w:tab/>
-        <w:t>14</w:t>
+        <w:t>15</w:t>
       </w:r>
     </w:p>
     <w:p>
@@ -989,7 +959,7 @@
           <w:i w:val="0"/>
           <w:sz w:val="26"/>
         </w:rPr>
-        <w:t>10. TÀI LIỆU THAM KHẢO DỰ KIẾN</w:t>
+        <w:t>11. Ý KIẾN CỦA GIẢNG VIÊN HƯỚNG DẪN</w:t>
       </w:r>
       <w:r>
         <w:rPr>
@@ -1000,34 +970,6 @@
         </w:rPr>
         <w:tab/>
         <w:t>16</w:t>
-      </w:r>
-    </w:p>
-    <w:p>
-      <w:pPr>
-        <w:tabs>
-          <w:tab w:pos="8957" w:val="right" w:leader="dot"/>
-        </w:tabs>
-        <w:spacing w:lineRule="auto" w:line="276" w:before="20" w:after="20"/>
-        <w:jc w:val="left"/>
-      </w:pPr>
-      <w:r>
-        <w:rPr>
-          <w:rFonts w:ascii="Times New Roman" w:hAnsi="Times New Roman" w:cs="Times New Roman" w:eastAsia="Times New Roman"/>
-          <w:b/>
-          <w:i w:val="0"/>
-          <w:sz w:val="26"/>
-        </w:rPr>
-        <w:t>11. Ý KIẾN CỦA GIẢNG VIÊN HƯỚNG DẪN</w:t>
-      </w:r>
-      <w:r>
-        <w:rPr>
-          <w:rFonts w:ascii="Times New Roman" w:hAnsi="Times New Roman" w:cs="Times New Roman" w:eastAsia="Times New Roman"/>
-          <w:b/>
-          <w:i w:val="0"/>
-          <w:sz w:val="26"/>
-        </w:rPr>
-        <w:tab/>
-        <w:t>17</w:t>
       </w:r>
     </w:p>
     <w:p>
@@ -6991,18 +6933,17 @@
     </w:p>
     <w:p>
       <w:pPr>
-        <w:keepNext/>
-        <w:spacing w:lineRule="auto" w:line="360" w:before="240" w:after="120"/>
-        <w:jc w:val="left"/>
-      </w:pPr>
-      <w:r>
-        <w:rPr>
-          <w:rFonts w:ascii="Times New Roman" w:hAnsi="Times New Roman" w:cs="Times New Roman" w:eastAsia="Times New Roman"/>
-          <w:b/>
+        <w:spacing w:lineRule="auto" w:line="360" w:before="120" w:after="120"/>
+        <w:jc w:val="both"/>
+      </w:pPr>
+      <w:r>
+        <w:rPr>
+          <w:rFonts w:ascii="Times New Roman" w:hAnsi="Times New Roman" w:cs="Times New Roman" w:eastAsia="Times New Roman"/>
+          <w:b w:val="0"/>
           <w:i w:val="0"/>
           <w:sz w:val="26"/>
         </w:rPr>
-        <w:t>9.1. Tiến độ theo tuần</w:t>
+        <w:t>Đề tài thực hiện trong tám tuần, phân chia theo bảng dưới đây.</w:t>
       </w:r>
     </w:p>
     <w:p>
@@ -7929,867 +7870,6 @@
           <w:sz w:val="26"/>
         </w:rPr>
         <w:t>. Không có commit thì dù có báo cáo tiến độ vẫn bị xem như không hoàn thành.</w:t>
-      </w:r>
-    </w:p>
-    <w:p>
-      <w:pPr>
-        <w:keepNext/>
-        <w:spacing w:lineRule="auto" w:line="360" w:before="240" w:after="120"/>
-        <w:jc w:val="left"/>
-      </w:pPr>
-      <w:r>
-        <w:rPr>
-          <w:rFonts w:ascii="Times New Roman" w:hAnsi="Times New Roman" w:cs="Times New Roman" w:eastAsia="Times New Roman"/>
-          <w:b/>
-          <w:i w:val="0"/>
-          <w:sz w:val="26"/>
-        </w:rPr>
-        <w:t>9.2. Rủi ro và phương án dự phòng</w:t>
-      </w:r>
-    </w:p>
-    <w:p>
-      <w:pPr>
-        <w:spacing w:lineRule="auto" w:line="360" w:before="120" w:after="120"/>
-        <w:jc w:val="both"/>
-      </w:pPr>
-      <w:r>
-        <w:rPr>
-          <w:rFonts w:ascii="Times New Roman" w:hAnsi="Times New Roman" w:cs="Times New Roman" w:eastAsia="Times New Roman"/>
-          <w:b w:val="0"/>
-          <w:i w:val="0"/>
-          <w:sz w:val="26"/>
-        </w:rPr>
-        <w:t>Kế hoạch tám tuần ở trên giả định mọi việc diễn ra đúng dự tính. Mục này liệt kê những chỗ dễ trật nhất cùng phương án xử lý đã chuẩn bị trước.</w:t>
-      </w:r>
-    </w:p>
-    <w:p>
-      <w:pPr>
-        <w:spacing w:lineRule="auto" w:line="276" w:before="160" w:after="60"/>
-        <w:jc w:val="center"/>
-      </w:pPr>
-      <w:r>
-        <w:rPr>
-          <w:rFonts w:ascii="Times New Roman" w:hAnsi="Times New Roman" w:cs="Times New Roman" w:eastAsia="Times New Roman"/>
-          <w:b/>
-          <w:i w:val="0"/>
-          <w:sz w:val="24"/>
-        </w:rPr>
-        <w:t xml:space="preserve">Bảng 8. </w:t>
-      </w:r>
-      <w:r>
-        <w:rPr>
-          <w:rFonts w:ascii="Times New Roman" w:hAnsi="Times New Roman" w:cs="Times New Roman" w:eastAsia="Times New Roman"/>
-          <w:b/>
-          <w:i w:val="0"/>
-          <w:sz w:val="24"/>
-        </w:rPr>
-        <w:t>Rủi ro và phương án dự phòng</w:t>
-      </w:r>
-    </w:p>
-    <w:tbl>
-      <w:tblPr>
-        <w:tblStyle w:val="TableGrid"/>
-        <w:tblW w:type="auto" w:w="0"/>
-        <w:jc w:val="center"/>
-        <w:tblLayout w:type="autofit"/>
-        <w:tblLook w:firstColumn="1" w:firstRow="1" w:lastColumn="0" w:lastRow="0" w:noHBand="0" w:noVBand="1" w:val="04A0"/>
-      </w:tblPr>
-      <w:tblGrid>
-        <w:gridCol w:w="1814"/>
-        <w:gridCol w:w="1814"/>
-        <w:gridCol w:w="1814"/>
-        <w:gridCol w:w="1814"/>
-        <w:gridCol w:w="1814"/>
-      </w:tblGrid>
-      <w:tr>
-        <w:trPr>
-          <w:tblHeader w:val="true"/>
-        </w:trPr>
-        <w:tc>
-          <w:tcPr>
-            <w:tcW w:type="dxa" w:w="1814"/>
-            <w:shd w:val="clear" w:fill="EFEDE7"/>
-          </w:tcPr>
-          <w:p>
-            <w:pPr>
-              <w:spacing w:lineRule="auto" w:line="240" w:before="20" w:after="20"/>
-              <w:jc w:val="left"/>
-            </w:pPr>
-            <w:r/>
-            <w:r>
-              <w:rPr>
-                <w:rFonts w:ascii="Times New Roman" w:hAnsi="Times New Roman" w:cs="Times New Roman" w:eastAsia="Times New Roman"/>
-                <w:b/>
-                <w:i w:val="0"/>
-                <w:sz w:val="22"/>
-              </w:rPr>
-              <w:t>#</w:t>
-            </w:r>
-          </w:p>
-        </w:tc>
-        <w:tc>
-          <w:tcPr>
-            <w:tcW w:type="dxa" w:w="1814"/>
-            <w:shd w:val="clear" w:fill="EFEDE7"/>
-          </w:tcPr>
-          <w:p>
-            <w:pPr>
-              <w:spacing w:lineRule="auto" w:line="240" w:before="20" w:after="20"/>
-              <w:jc w:val="left"/>
-            </w:pPr>
-            <w:r/>
-            <w:r>
-              <w:rPr>
-                <w:rFonts w:ascii="Times New Roman" w:hAnsi="Times New Roman" w:cs="Times New Roman" w:eastAsia="Times New Roman"/>
-                <w:b/>
-                <w:i w:val="0"/>
-                <w:sz w:val="22"/>
-              </w:rPr>
-              <w:t>Rủi ro</w:t>
-            </w:r>
-          </w:p>
-        </w:tc>
-        <w:tc>
-          <w:tcPr>
-            <w:tcW w:type="dxa" w:w="1814"/>
-            <w:shd w:val="clear" w:fill="EFEDE7"/>
-          </w:tcPr>
-          <w:p>
-            <w:pPr>
-              <w:spacing w:lineRule="auto" w:line="240" w:before="20" w:after="20"/>
-              <w:jc w:val="left"/>
-            </w:pPr>
-            <w:r/>
-            <w:r>
-              <w:rPr>
-                <w:rFonts w:ascii="Times New Roman" w:hAnsi="Times New Roman" w:cs="Times New Roman" w:eastAsia="Times New Roman"/>
-                <w:b/>
-                <w:i w:val="0"/>
-                <w:sz w:val="22"/>
-              </w:rPr>
-              <w:t>Khả năng</w:t>
-            </w:r>
-          </w:p>
-        </w:tc>
-        <w:tc>
-          <w:tcPr>
-            <w:tcW w:type="dxa" w:w="1814"/>
-            <w:shd w:val="clear" w:fill="EFEDE7"/>
-          </w:tcPr>
-          <w:p>
-            <w:pPr>
-              <w:spacing w:lineRule="auto" w:line="240" w:before="20" w:after="20"/>
-              <w:jc w:val="left"/>
-            </w:pPr>
-            <w:r/>
-            <w:r>
-              <w:rPr>
-                <w:rFonts w:ascii="Times New Roman" w:hAnsi="Times New Roman" w:cs="Times New Roman" w:eastAsia="Times New Roman"/>
-                <w:b/>
-                <w:i w:val="0"/>
-                <w:sz w:val="22"/>
-              </w:rPr>
-              <w:t>Ảnh hưởng</w:t>
-            </w:r>
-          </w:p>
-        </w:tc>
-        <w:tc>
-          <w:tcPr>
-            <w:tcW w:type="dxa" w:w="1814"/>
-            <w:shd w:val="clear" w:fill="EFEDE7"/>
-          </w:tcPr>
-          <w:p>
-            <w:pPr>
-              <w:spacing w:lineRule="auto" w:line="240" w:before="20" w:after="20"/>
-              <w:jc w:val="left"/>
-            </w:pPr>
-            <w:r/>
-            <w:r>
-              <w:rPr>
-                <w:rFonts w:ascii="Times New Roman" w:hAnsi="Times New Roman" w:cs="Times New Roman" w:eastAsia="Times New Roman"/>
-                <w:b/>
-                <w:i w:val="0"/>
-                <w:sz w:val="22"/>
-              </w:rPr>
-              <w:t>Phương án dự phòng</w:t>
-            </w:r>
-          </w:p>
-        </w:tc>
-      </w:tr>
-      <w:tr>
-        <w:tc>
-          <w:tcPr>
-            <w:tcW w:type="dxa" w:w="1814"/>
-          </w:tcPr>
-          <w:p>
-            <w:pPr>
-              <w:spacing w:lineRule="auto" w:line="240" w:before="20" w:after="20"/>
-              <w:jc w:val="left"/>
-            </w:pPr>
-            <w:r/>
-            <w:r>
-              <w:rPr>
-                <w:rFonts w:ascii="Times New Roman" w:hAnsi="Times New Roman" w:cs="Times New Roman" w:eastAsia="Times New Roman"/>
-                <w:b w:val="0"/>
-                <w:i w:val="0"/>
-                <w:sz w:val="22"/>
-              </w:rPr>
-              <w:t>1</w:t>
-            </w:r>
-          </w:p>
-        </w:tc>
-        <w:tc>
-          <w:tcPr>
-            <w:tcW w:type="dxa" w:w="1814"/>
-          </w:tcPr>
-          <w:p>
-            <w:pPr>
-              <w:spacing w:lineRule="auto" w:line="240" w:before="20" w:after="20"/>
-              <w:jc w:val="left"/>
-            </w:pPr>
-            <w:r/>
-            <w:r>
-              <w:rPr>
-                <w:rFonts w:ascii="Times New Roman" w:hAnsi="Times New Roman" w:cs="Times New Roman" w:eastAsia="Times New Roman"/>
-                <w:b w:val="0"/>
-                <w:i w:val="0"/>
-                <w:sz w:val="22"/>
-              </w:rPr>
-              <w:t>Ràng buộc chống đặt trùng phòng cài xong nhưng kiểm thử đa luồng vẫn sinh đơn trùng</w:t>
-            </w:r>
-          </w:p>
-        </w:tc>
-        <w:tc>
-          <w:tcPr>
-            <w:tcW w:type="dxa" w:w="1814"/>
-          </w:tcPr>
-          <w:p>
-            <w:pPr>
-              <w:spacing w:lineRule="auto" w:line="240" w:before="20" w:after="20"/>
-              <w:jc w:val="left"/>
-            </w:pPr>
-            <w:r/>
-            <w:r>
-              <w:rPr>
-                <w:rFonts w:ascii="Times New Roman" w:hAnsi="Times New Roman" w:cs="Times New Roman" w:eastAsia="Times New Roman"/>
-                <w:b w:val="0"/>
-                <w:i w:val="0"/>
-                <w:sz w:val="22"/>
-              </w:rPr>
-              <w:t>Trung bình</w:t>
-            </w:r>
-          </w:p>
-        </w:tc>
-        <w:tc>
-          <w:tcPr>
-            <w:tcW w:type="dxa" w:w="1814"/>
-          </w:tcPr>
-          <w:p>
-            <w:pPr>
-              <w:spacing w:lineRule="auto" w:line="240" w:before="20" w:after="20"/>
-              <w:jc w:val="left"/>
-            </w:pPr>
-            <w:r/>
-            <w:r>
-              <w:rPr>
-                <w:rFonts w:ascii="Times New Roman" w:hAnsi="Times New Roman" w:cs="Times New Roman" w:eastAsia="Times New Roman"/>
-                <w:b/>
-                <w:i w:val="0"/>
-                <w:sz w:val="22"/>
-              </w:rPr>
-              <w:t>Nghiêm trọng</w:t>
-            </w:r>
-            <w:r>
-              <w:rPr>
-                <w:rFonts w:ascii="Times New Roman" w:hAnsi="Times New Roman" w:cs="Times New Roman" w:eastAsia="Times New Roman"/>
-                <w:b w:val="0"/>
-                <w:i w:val="0"/>
-                <w:sz w:val="22"/>
-              </w:rPr>
-              <w:t xml:space="preserve"> — đây là mục tiêu số 2</w:t>
-            </w:r>
-          </w:p>
-        </w:tc>
-        <w:tc>
-          <w:tcPr>
-            <w:tcW w:type="dxa" w:w="1814"/>
-          </w:tcPr>
-          <w:p>
-            <w:pPr>
-              <w:spacing w:lineRule="auto" w:line="240" w:before="20" w:after="20"/>
-              <w:jc w:val="left"/>
-            </w:pPr>
-            <w:r/>
-            <w:r>
-              <w:rPr>
-                <w:rFonts w:ascii="Times New Roman" w:hAnsi="Times New Roman" w:cs="Times New Roman" w:eastAsia="Times New Roman"/>
-                <w:b w:val="0"/>
-                <w:i w:val="0"/>
-                <w:sz w:val="22"/>
-              </w:rPr>
-              <w:t>Tuần 3 là mốc sớm có chủ đích, còn đủ thời gian đổi cách: chuyển sang khoá bi quan trên hàng dữ liệu phòng. Chậm hơn nhưng vẫn đúng, và sự chênh lệch đó tự nó là kết quả nghiên cứu đáng báo cáo</w:t>
-            </w:r>
-          </w:p>
-        </w:tc>
-      </w:tr>
-      <w:tr>
-        <w:tc>
-          <w:tcPr>
-            <w:tcW w:type="dxa" w:w="1814"/>
-          </w:tcPr>
-          <w:p>
-            <w:pPr>
-              <w:spacing w:lineRule="auto" w:line="240" w:before="20" w:after="20"/>
-              <w:jc w:val="left"/>
-            </w:pPr>
-            <w:r/>
-            <w:r>
-              <w:rPr>
-                <w:rFonts w:ascii="Times New Roman" w:hAnsi="Times New Roman" w:cs="Times New Roman" w:eastAsia="Times New Roman"/>
-                <w:b w:val="0"/>
-                <w:i w:val="0"/>
-                <w:sz w:val="22"/>
-              </w:rPr>
-              <w:t>2</w:t>
-            </w:r>
-          </w:p>
-        </w:tc>
-        <w:tc>
-          <w:tcPr>
-            <w:tcW w:type="dxa" w:w="1814"/>
-          </w:tcPr>
-          <w:p>
-            <w:pPr>
-              <w:spacing w:lineRule="auto" w:line="240" w:before="20" w:after="20"/>
-              <w:jc w:val="left"/>
-            </w:pPr>
-            <w:r/>
-            <w:r>
-              <w:rPr>
-                <w:rFonts w:ascii="Times New Roman" w:hAnsi="Times New Roman" w:cs="Times New Roman" w:eastAsia="Times New Roman"/>
-                <w:b w:val="0"/>
-                <w:i w:val="0"/>
-                <w:sz w:val="22"/>
-              </w:rPr>
-              <w:t>Không xin được tài khoản thử của dịch vụ thanh toán</w:t>
-            </w:r>
-          </w:p>
-        </w:tc>
-        <w:tc>
-          <w:tcPr>
-            <w:tcW w:type="dxa" w:w="1814"/>
-          </w:tcPr>
-          <w:p>
-            <w:pPr>
-              <w:spacing w:lineRule="auto" w:line="240" w:before="20" w:after="20"/>
-              <w:jc w:val="left"/>
-            </w:pPr>
-            <w:r/>
-            <w:r>
-              <w:rPr>
-                <w:rFonts w:ascii="Times New Roman" w:hAnsi="Times New Roman" w:cs="Times New Roman" w:eastAsia="Times New Roman"/>
-                <w:b w:val="0"/>
-                <w:i w:val="0"/>
-                <w:sz w:val="22"/>
-              </w:rPr>
-              <w:t>Trung bình</w:t>
-            </w:r>
-          </w:p>
-        </w:tc>
-        <w:tc>
-          <w:tcPr>
-            <w:tcW w:type="dxa" w:w="1814"/>
-          </w:tcPr>
-          <w:p>
-            <w:pPr>
-              <w:spacing w:lineRule="auto" w:line="240" w:before="20" w:after="20"/>
-              <w:jc w:val="left"/>
-            </w:pPr>
-            <w:r/>
-            <w:r>
-              <w:rPr>
-                <w:rFonts w:ascii="Times New Roman" w:hAnsi="Times New Roman" w:cs="Times New Roman" w:eastAsia="Times New Roman"/>
-                <w:b w:val="0"/>
-                <w:i w:val="0"/>
-                <w:sz w:val="22"/>
-              </w:rPr>
-              <w:t>Lớn — chặn tuần 5</w:t>
-            </w:r>
-          </w:p>
-        </w:tc>
-        <w:tc>
-          <w:tcPr>
-            <w:tcW w:type="dxa" w:w="1814"/>
-          </w:tcPr>
-          <w:p>
-            <w:pPr>
-              <w:spacing w:lineRule="auto" w:line="240" w:before="20" w:after="20"/>
-              <w:jc w:val="left"/>
-            </w:pPr>
-            <w:r/>
-            <w:r>
-              <w:rPr>
-                <w:rFonts w:ascii="Times New Roman" w:hAnsi="Times New Roman" w:cs="Times New Roman" w:eastAsia="Times New Roman"/>
-                <w:b w:val="0"/>
-                <w:i w:val="0"/>
-                <w:sz w:val="22"/>
-              </w:rPr>
-              <w:t>Tự dựng bộ giả lập webhook gọi đúng giao diện lập trình ứng dụng thật. Luồng nghiệp vụ và phần kiểm thử không đổi; chỉ nguồn gọi là giả</w:t>
-            </w:r>
-          </w:p>
-        </w:tc>
-      </w:tr>
-      <w:tr>
-        <w:tc>
-          <w:tcPr>
-            <w:tcW w:type="dxa" w:w="1814"/>
-          </w:tcPr>
-          <w:p>
-            <w:pPr>
-              <w:spacing w:lineRule="auto" w:line="240" w:before="20" w:after="20"/>
-              <w:jc w:val="left"/>
-            </w:pPr>
-            <w:r/>
-            <w:r>
-              <w:rPr>
-                <w:rFonts w:ascii="Times New Roman" w:hAnsi="Times New Roman" w:cs="Times New Roman" w:eastAsia="Times New Roman"/>
-                <w:b w:val="0"/>
-                <w:i w:val="0"/>
-                <w:sz w:val="22"/>
-              </w:rPr>
-              <w:t>3</w:t>
-            </w:r>
-          </w:p>
-        </w:tc>
-        <w:tc>
-          <w:tcPr>
-            <w:tcW w:type="dxa" w:w="1814"/>
-          </w:tcPr>
-          <w:p>
-            <w:pPr>
-              <w:spacing w:lineRule="auto" w:line="240" w:before="20" w:after="20"/>
-              <w:jc w:val="left"/>
-            </w:pPr>
-            <w:r/>
-            <w:r>
-              <w:rPr>
-                <w:rFonts w:ascii="Times New Roman" w:hAnsi="Times New Roman" w:cs="Times New Roman" w:eastAsia="Times New Roman"/>
-                <w:b w:val="0"/>
-                <w:i w:val="0"/>
-                <w:sz w:val="22"/>
-              </w:rPr>
-              <w:t>Kiểm thử tích hợp cần cơ sở dữ liệu thật trong container, máy cá nhân không chạy nổi</w:t>
-            </w:r>
-          </w:p>
-        </w:tc>
-        <w:tc>
-          <w:tcPr>
-            <w:tcW w:type="dxa" w:w="1814"/>
-          </w:tcPr>
-          <w:p>
-            <w:pPr>
-              <w:spacing w:lineRule="auto" w:line="240" w:before="20" w:after="20"/>
-              <w:jc w:val="left"/>
-            </w:pPr>
-            <w:r/>
-            <w:r>
-              <w:rPr>
-                <w:rFonts w:ascii="Times New Roman" w:hAnsi="Times New Roman" w:cs="Times New Roman" w:eastAsia="Times New Roman"/>
-                <w:b w:val="0"/>
-                <w:i w:val="0"/>
-                <w:sz w:val="22"/>
-              </w:rPr>
-              <w:t>Thấp</w:t>
-            </w:r>
-          </w:p>
-        </w:tc>
-        <w:tc>
-          <w:tcPr>
-            <w:tcW w:type="dxa" w:w="1814"/>
-          </w:tcPr>
-          <w:p>
-            <w:pPr>
-              <w:spacing w:lineRule="auto" w:line="240" w:before="20" w:after="20"/>
-              <w:jc w:val="left"/>
-            </w:pPr>
-            <w:r/>
-            <w:r>
-              <w:rPr>
-                <w:rFonts w:ascii="Times New Roman" w:hAnsi="Times New Roman" w:cs="Times New Roman" w:eastAsia="Times New Roman"/>
-                <w:b w:val="0"/>
-                <w:i w:val="0"/>
-                <w:sz w:val="22"/>
-              </w:rPr>
-              <w:t>Trung bình</w:t>
-            </w:r>
-          </w:p>
-        </w:tc>
-        <w:tc>
-          <w:tcPr>
-            <w:tcW w:type="dxa" w:w="1814"/>
-          </w:tcPr>
-          <w:p>
-            <w:pPr>
-              <w:spacing w:lineRule="auto" w:line="240" w:before="20" w:after="20"/>
-              <w:jc w:val="left"/>
-            </w:pPr>
-            <w:r/>
-            <w:r>
-              <w:rPr>
-                <w:rFonts w:ascii="Times New Roman" w:hAnsi="Times New Roman" w:cs="Times New Roman" w:eastAsia="Times New Roman"/>
-                <w:b w:val="0"/>
-                <w:i w:val="0"/>
-                <w:sz w:val="22"/>
-              </w:rPr>
-              <w:t>Hạ số ca chạy song song và chạy theo nhóm; chấp nhận bộ kiểm thử chạy lâu hơn, không chấp nhận giả lập cơ sở dữ liệu</w:t>
-            </w:r>
-          </w:p>
-        </w:tc>
-      </w:tr>
-      <w:tr>
-        <w:tc>
-          <w:tcPr>
-            <w:tcW w:type="dxa" w:w="1814"/>
-          </w:tcPr>
-          <w:p>
-            <w:pPr>
-              <w:spacing w:lineRule="auto" w:line="240" w:before="20" w:after="20"/>
-              <w:jc w:val="left"/>
-            </w:pPr>
-            <w:r/>
-            <w:r>
-              <w:rPr>
-                <w:rFonts w:ascii="Times New Roman" w:hAnsi="Times New Roman" w:cs="Times New Roman" w:eastAsia="Times New Roman"/>
-                <w:b w:val="0"/>
-                <w:i w:val="0"/>
-                <w:sz w:val="22"/>
-              </w:rPr>
-              <w:t>4</w:t>
-            </w:r>
-          </w:p>
-        </w:tc>
-        <w:tc>
-          <w:tcPr>
-            <w:tcW w:type="dxa" w:w="1814"/>
-          </w:tcPr>
-          <w:p>
-            <w:pPr>
-              <w:spacing w:lineRule="auto" w:line="240" w:before="20" w:after="20"/>
-              <w:jc w:val="left"/>
-            </w:pPr>
-            <w:r/>
-            <w:r>
-              <w:rPr>
-                <w:rFonts w:ascii="Times New Roman" w:hAnsi="Times New Roman" w:cs="Times New Roman" w:eastAsia="Times New Roman"/>
-                <w:b w:val="0"/>
-                <w:i w:val="0"/>
-                <w:sz w:val="22"/>
-              </w:rPr>
-              <w:t>Phạm vi phình ra vì phát sinh yêu cầu mới giữa chừng</w:t>
-            </w:r>
-          </w:p>
-        </w:tc>
-        <w:tc>
-          <w:tcPr>
-            <w:tcW w:type="dxa" w:w="1814"/>
-          </w:tcPr>
-          <w:p>
-            <w:pPr>
-              <w:spacing w:lineRule="auto" w:line="240" w:before="20" w:after="20"/>
-              <w:jc w:val="left"/>
-            </w:pPr>
-            <w:r/>
-            <w:r>
-              <w:rPr>
-                <w:rFonts w:ascii="Times New Roman" w:hAnsi="Times New Roman" w:cs="Times New Roman" w:eastAsia="Times New Roman"/>
-                <w:b/>
-                <w:i w:val="0"/>
-                <w:sz w:val="22"/>
-              </w:rPr>
-              <w:t>Cao</w:t>
-            </w:r>
-          </w:p>
-        </w:tc>
-        <w:tc>
-          <w:tcPr>
-            <w:tcW w:type="dxa" w:w="1814"/>
-          </w:tcPr>
-          <w:p>
-            <w:pPr>
-              <w:spacing w:lineRule="auto" w:line="240" w:before="20" w:after="20"/>
-              <w:jc w:val="left"/>
-            </w:pPr>
-            <w:r/>
-            <w:r>
-              <w:rPr>
-                <w:rFonts w:ascii="Times New Roman" w:hAnsi="Times New Roman" w:cs="Times New Roman" w:eastAsia="Times New Roman"/>
-                <w:b w:val="0"/>
-                <w:i w:val="0"/>
-                <w:sz w:val="22"/>
-              </w:rPr>
-              <w:t>Lớn</w:t>
-            </w:r>
-          </w:p>
-        </w:tc>
-        <w:tc>
-          <w:tcPr>
-            <w:tcW w:type="dxa" w:w="1814"/>
-          </w:tcPr>
-          <w:p>
-            <w:pPr>
-              <w:spacing w:lineRule="auto" w:line="240" w:before="20" w:after="20"/>
-              <w:jc w:val="left"/>
-            </w:pPr>
-            <w:r/>
-            <w:r>
-              <w:rPr>
-                <w:rFonts w:ascii="Times New Roman" w:hAnsi="Times New Roman" w:cs="Times New Roman" w:eastAsia="Times New Roman"/>
-                <w:b w:val="0"/>
-                <w:i w:val="0"/>
-                <w:sz w:val="22"/>
-              </w:rPr>
-              <w:t>Mục 4.3 đã liệt kê sẵn những gì đề tài KHÔNG làm. Mọi yêu cầu mới ghi vào mục "hướng phát triển", không đưa vào phạm vi nghiệm thu</w:t>
-            </w:r>
-          </w:p>
-        </w:tc>
-      </w:tr>
-      <w:tr>
-        <w:tc>
-          <w:tcPr>
-            <w:tcW w:type="dxa" w:w="1814"/>
-          </w:tcPr>
-          <w:p>
-            <w:pPr>
-              <w:spacing w:lineRule="auto" w:line="240" w:before="20" w:after="20"/>
-              <w:jc w:val="left"/>
-            </w:pPr>
-            <w:r/>
-            <w:r>
-              <w:rPr>
-                <w:rFonts w:ascii="Times New Roman" w:hAnsi="Times New Roman" w:cs="Times New Roman" w:eastAsia="Times New Roman"/>
-                <w:b w:val="0"/>
-                <w:i w:val="0"/>
-                <w:sz w:val="22"/>
-              </w:rPr>
-              <w:t>5</w:t>
-            </w:r>
-          </w:p>
-        </w:tc>
-        <w:tc>
-          <w:tcPr>
-            <w:tcW w:type="dxa" w:w="1814"/>
-          </w:tcPr>
-          <w:p>
-            <w:pPr>
-              <w:spacing w:lineRule="auto" w:line="240" w:before="20" w:after="20"/>
-              <w:jc w:val="left"/>
-            </w:pPr>
-            <w:r/>
-            <w:r>
-              <w:rPr>
-                <w:rFonts w:ascii="Times New Roman" w:hAnsi="Times New Roman" w:cs="Times New Roman" w:eastAsia="Times New Roman"/>
-                <w:b w:val="0"/>
-                <w:i w:val="0"/>
-                <w:sz w:val="22"/>
-              </w:rPr>
-              <w:t>Viết báo cáo dồn vào cuối, không kịp</w:t>
-            </w:r>
-          </w:p>
-        </w:tc>
-        <w:tc>
-          <w:tcPr>
-            <w:tcW w:type="dxa" w:w="1814"/>
-          </w:tcPr>
-          <w:p>
-            <w:pPr>
-              <w:spacing w:lineRule="auto" w:line="240" w:before="20" w:after="20"/>
-              <w:jc w:val="left"/>
-            </w:pPr>
-            <w:r/>
-            <w:r>
-              <w:rPr>
-                <w:rFonts w:ascii="Times New Roman" w:hAnsi="Times New Roman" w:cs="Times New Roman" w:eastAsia="Times New Roman"/>
-                <w:b/>
-                <w:i w:val="0"/>
-                <w:sz w:val="22"/>
-              </w:rPr>
-              <w:t>Cao</w:t>
-            </w:r>
-          </w:p>
-        </w:tc>
-        <w:tc>
-          <w:tcPr>
-            <w:tcW w:type="dxa" w:w="1814"/>
-          </w:tcPr>
-          <w:p>
-            <w:pPr>
-              <w:spacing w:lineRule="auto" w:line="240" w:before="20" w:after="20"/>
-              <w:jc w:val="left"/>
-            </w:pPr>
-            <w:r/>
-            <w:r>
-              <w:rPr>
-                <w:rFonts w:ascii="Times New Roman" w:hAnsi="Times New Roman" w:cs="Times New Roman" w:eastAsia="Times New Roman"/>
-                <w:b/>
-                <w:i w:val="0"/>
-                <w:sz w:val="22"/>
-              </w:rPr>
-              <w:t>Nghiêm trọng</w:t>
-            </w:r>
-            <w:r>
-              <w:rPr>
-                <w:rFonts w:ascii="Times New Roman" w:hAnsi="Times New Roman" w:cs="Times New Roman" w:eastAsia="Times New Roman"/>
-                <w:b w:val="0"/>
-                <w:i w:val="0"/>
-                <w:sz w:val="22"/>
-              </w:rPr>
-              <w:t xml:space="preserve"> — tám tuần không có tuần nào dành riêng cho việc viết</w:t>
-            </w:r>
-          </w:p>
-        </w:tc>
-        <w:tc>
-          <w:tcPr>
-            <w:tcW w:type="dxa" w:w="1814"/>
-          </w:tcPr>
-          <w:p>
-            <w:pPr>
-              <w:spacing w:lineRule="auto" w:line="240" w:before="20" w:after="20"/>
-              <w:jc w:val="left"/>
-            </w:pPr>
-            <w:r/>
-            <w:r>
-              <w:rPr>
-                <w:rFonts w:ascii="Times New Roman" w:hAnsi="Times New Roman" w:cs="Times New Roman" w:eastAsia="Times New Roman"/>
-                <w:b w:val="0"/>
-                <w:i w:val="0"/>
-                <w:sz w:val="22"/>
-              </w:rPr>
-              <w:t>Viết dần từ tuần 1: mỗi tuần ghi lại quyết định và kết quả đo được ngay khi còn nhớ, để tuần 7 và 8 chỉ còn việc biên tập lại. Mốc nộp bản thảo hai chương đầu ở tuần 7 là chốt chặn</w:t>
-            </w:r>
-          </w:p>
-        </w:tc>
-      </w:tr>
-      <w:tr>
-        <w:tc>
-          <w:tcPr>
-            <w:tcW w:type="dxa" w:w="1814"/>
-          </w:tcPr>
-          <w:p>
-            <w:pPr>
-              <w:spacing w:lineRule="auto" w:line="240" w:before="20" w:after="20"/>
-              <w:jc w:val="left"/>
-            </w:pPr>
-            <w:r/>
-            <w:r>
-              <w:rPr>
-                <w:rFonts w:ascii="Times New Roman" w:hAnsi="Times New Roman" w:cs="Times New Roman" w:eastAsia="Times New Roman"/>
-                <w:b w:val="0"/>
-                <w:i w:val="0"/>
-                <w:sz w:val="22"/>
-              </w:rPr>
-              <w:t>6</w:t>
-            </w:r>
-          </w:p>
-        </w:tc>
-        <w:tc>
-          <w:tcPr>
-            <w:tcW w:type="dxa" w:w="1814"/>
-          </w:tcPr>
-          <w:p>
-            <w:pPr>
-              <w:spacing w:lineRule="auto" w:line="240" w:before="20" w:after="20"/>
-              <w:jc w:val="left"/>
-            </w:pPr>
-            <w:r/>
-            <w:r>
-              <w:rPr>
-                <w:rFonts w:ascii="Times New Roman" w:hAnsi="Times New Roman" w:cs="Times New Roman" w:eastAsia="Times New Roman"/>
-                <w:b w:val="0"/>
-                <w:i w:val="0"/>
-                <w:sz w:val="22"/>
-              </w:rPr>
-              <w:t>Quên nộp báo cáo tiến độ hoặc không commit đủ tuần</w:t>
-            </w:r>
-          </w:p>
-        </w:tc>
-        <w:tc>
-          <w:tcPr>
-            <w:tcW w:type="dxa" w:w="1814"/>
-          </w:tcPr>
-          <w:p>
-            <w:pPr>
-              <w:spacing w:lineRule="auto" w:line="240" w:before="20" w:after="20"/>
-              <w:jc w:val="left"/>
-            </w:pPr>
-            <w:r/>
-            <w:r>
-              <w:rPr>
-                <w:rFonts w:ascii="Times New Roman" w:hAnsi="Times New Roman" w:cs="Times New Roman" w:eastAsia="Times New Roman"/>
-                <w:b w:val="0"/>
-                <w:i w:val="0"/>
-                <w:sz w:val="22"/>
-              </w:rPr>
-              <w:t>Trung bình</w:t>
-            </w:r>
-          </w:p>
-        </w:tc>
-        <w:tc>
-          <w:tcPr>
-            <w:tcW w:type="dxa" w:w="1814"/>
-          </w:tcPr>
-          <w:p>
-            <w:pPr>
-              <w:spacing w:lineRule="auto" w:line="240" w:before="20" w:after="20"/>
-              <w:jc w:val="left"/>
-            </w:pPr>
-            <w:r/>
-            <w:r>
-              <w:rPr>
-                <w:rFonts w:ascii="Times New Roman" w:hAnsi="Times New Roman" w:cs="Times New Roman" w:eastAsia="Times New Roman"/>
-                <w:b w:val="0"/>
-                <w:i w:val="0"/>
-                <w:sz w:val="22"/>
-              </w:rPr>
-              <w:t>Lớn — là tiêu chí chấm điểm</w:t>
-            </w:r>
-          </w:p>
-        </w:tc>
-        <w:tc>
-          <w:tcPr>
-            <w:tcW w:type="dxa" w:w="1814"/>
-          </w:tcPr>
-          <w:p>
-            <w:pPr>
-              <w:spacing w:lineRule="auto" w:line="240" w:before="20" w:after="20"/>
-              <w:jc w:val="left"/>
-            </w:pPr>
-            <w:r/>
-            <w:r>
-              <w:rPr>
-                <w:rFonts w:ascii="Times New Roman" w:hAnsi="Times New Roman" w:cs="Times New Roman" w:eastAsia="Times New Roman"/>
-                <w:b w:val="0"/>
-                <w:i w:val="0"/>
-                <w:sz w:val="22"/>
-              </w:rPr>
-              <w:t>Coi việc commit và nộp báo cáo tiến độ là một hạng mục cố định cuối mỗi tuần, ngang với công việc kỹ thuật của tuần đó</w:t>
-            </w:r>
-          </w:p>
-        </w:tc>
-      </w:tr>
-    </w:tbl>
-    <w:p>
-      <w:pPr>
-        <w:spacing w:lineRule="auto" w:line="360" w:before="120" w:after="120"/>
-        <w:jc w:val="both"/>
-      </w:pPr>
-      <w:r>
-        <w:rPr>
-          <w:rFonts w:ascii="Times New Roman" w:hAnsi="Times New Roman" w:cs="Times New Roman" w:eastAsia="Times New Roman"/>
-          <w:b w:val="0"/>
-          <w:i w:val="0"/>
-          <w:sz w:val="26"/>
-        </w:rPr>
-        <w:t>Trong sáu rủi ro trên, ba rủi ro số 1, 4 và 5 cần theo dõi sát nhất. Rủi ro số 1 quyết định đề tài có đạt mục tiêu cốt lõi hay không; rủi ro số 4 và số 5 là hai nguyên nhân thường gặp khiến một đồ án đủ năng lực vẫn không hoàn thành đúng hạn.</w:t>
       </w:r>
     </w:p>
     <w:p>

</xml_diff>

<commit_message>
feat(de-cuong): dien thong tin sinh vien vao trang bia va chan trang
Ho ten, MSSV va lop doc tu chu thich trong chinh tep Markdown:

    <!-- sinh-vien: Nguyen Hong Quan | 170123592 | DX23TT11 -->

Khong go cung trong bo chuyen. Bo chuyen dung chung cho nhieu tai lieu nen
du lieu cua mot tai lieu phai nam trong tai lieu do. Thieu truong nao thi
trang bia va chan trang van de dau cham cho cho do, nen tep chua khai van
xuat duoc nhu cu.

Chan trang hien tren moi trang tu trang 2; trang bia van khong co chan trang
vi no nam o section rieng.

Van 16 trang, muc luc 25/25 dung. Ten giang vien huong dan van de trong.

Co-Authored-By: Claude Opus 5 <noreply@anthropic.com>
Claude-Session: https://claude.ai/code/session_01AEgUuwxWZb75UPoWigF6iK
</commit_message>
<xml_diff>
--- a/thesis/doc/de-cuong-do-an.docx
+++ b/thesis/doc/de-cuong-do-an.docx
@@ -165,7 +165,7 @@
           <w:i w:val="0"/>
           <w:sz w:val="26"/>
         </w:rPr>
-        <w:t xml:space="preserve"> . . . . . . . . . . . . . . . . . . . . . . .</w:t>
+        <w:t xml:space="preserve"> Nguyễn Hồng Quân</w:t>
       </w:r>
     </w:p>
     <w:p>
@@ -190,7 +190,7 @@
           <w:i w:val="0"/>
           <w:sz w:val="26"/>
         </w:rPr>
-        <w:t xml:space="preserve"> . . . . . . . . . . . . . . .</w:t>
+        <w:t xml:space="preserve"> 170123592</w:t>
       </w:r>
     </w:p>
     <w:p>
@@ -215,7 +215,7 @@
           <w:i w:val="0"/>
           <w:sz w:val="26"/>
         </w:rPr>
-        <w:t xml:space="preserve"> . . . . . . . . . . . . . . .</w:t>
+        <w:t xml:space="preserve"> DX23TT11</w:t>
       </w:r>
     </w:p>
     <w:p>
@@ -8921,7 +8921,7 @@
         <w:i w:val="0"/>
         <w:sz w:val="22"/>
       </w:rPr>
-      <w:t>. . . . . . . . . . . . . . . . . .  -  MSSV . . . . . . . . . . . .  -  Lớp . . . . . . . . . . . .</w:t>
+      <w:t>Nguyễn Hồng Quân  -  MSSV 170123592  -  Lớp DX23TT11</w:t>
     </w:r>
     <w:r>
       <w:rPr>

</xml_diff>

<commit_message>
docs(de-cuong): bo ba o danh dau va dong "Noi dung can chinh sua" o muc 11
Muc 11 gio chi con phan de trong cho GVHD ghi y kien, bang ky ten va dong
ngay thang.

Van 16 trang, muc luc 25/25 dung.

Co-Authored-By: Claude Opus 5 <noreply@anthropic.com>
Claude-Session: https://claude.ai/code/session_01AEgUuwxWZb75UPoWigF6iK
</commit_message>
<xml_diff>
--- a/thesis/doc/de-cuong-do-an.docx
+++ b/thesis/doc/de-cuong-do-an.docx
@@ -8400,36 +8400,6 @@
           <w:sz w:val="27"/>
         </w:rPr>
         <w:t>11. Ý KIẾN CỦA GIẢNG VIÊN HƯỚNG DẪN</w:t>
-      </w:r>
-    </w:p>
-    <w:p>
-      <w:pPr>
-        <w:spacing w:lineRule="auto" w:line="360" w:before="120" w:after="120"/>
-        <w:jc w:val="both"/>
-      </w:pPr>
-      <w:r>
-        <w:rPr>
-          <w:rFonts w:ascii="Times New Roman" w:hAnsi="Times New Roman" w:cs="Times New Roman" w:eastAsia="Times New Roman"/>
-          <w:b w:val="0"/>
-          <w:i w:val="0"/>
-          <w:sz w:val="26"/>
-        </w:rPr>
-        <w:t>☐ Đồng ý cho thực hiện    ☐ Cần chỉnh sửa    ☐ Không đồng ý</w:t>
-      </w:r>
-    </w:p>
-    <w:p>
-      <w:pPr>
-        <w:spacing w:lineRule="auto" w:line="360" w:before="120" w:after="120"/>
-        <w:jc w:val="both"/>
-      </w:pPr>
-      <w:r>
-        <w:rPr>
-          <w:rFonts w:ascii="Times New Roman" w:hAnsi="Times New Roman" w:cs="Times New Roman" w:eastAsia="Times New Roman"/>
-          <w:b w:val="0"/>
-          <w:i w:val="0"/>
-          <w:sz w:val="26"/>
-        </w:rPr>
-        <w:t>Nội dung cần chỉnh sửa:</w:t>
       </w:r>
     </w:p>
     <w:p>

</xml_diff>

<commit_message>
feat(de-cuong): them ten GVHD va dong noi-ngay o trang bia
Hai truong moi doc tu chu thich trong tep Markdown, cung cach voi thong tin
sinh vien:

    <!-- gvhd: ThS. Nguyen Nhut Lam -->
    <!-- noi-ngay: TP. Ho Chi Minh, thang 9 nam 2026 -->

Thieu truong nao thi trang bia van de dau cham nhu cu.

Dong ky ten cuoi muc 11 cung doi "Tra Vinh" thanh "TP. Ho Chi Minh" cho khop
voi bia; ngay va thang o dong do van de trong vi GVHD dien luc ky.

Van 16 trang, muc luc 25/25 dung.

Co-Authored-By: Claude Opus 5 <noreply@anthropic.com>
Claude-Session: https://claude.ai/code/session_01AEgUuwxWZb75UPoWigF6iK
</commit_message>
<xml_diff>
--- a/thesis/doc/de-cuong-do-an.docx
+++ b/thesis/doc/de-cuong-do-an.docx
@@ -124,7 +124,7 @@
           <w:i w:val="0"/>
           <w:sz w:val="26"/>
         </w:rPr>
-        <w:t xml:space="preserve"> . . . . . . . . . . . . . . . . . . . . . . .</w:t>
+        <w:t xml:space="preserve"> ThS. Nguyễn Nhứt Lam</w:t>
       </w:r>
     </w:p>
     <w:p>
@@ -230,7 +230,7 @@
           <w:i/>
           <w:sz w:val="26"/>
         </w:rPr>
-        <w:t>Trà Vinh, tháng . . . năm 20 . . .</w:t>
+        <w:t>TP. Hồ Chí Minh, tháng 9 năm 2026</w:t>
       </w:r>
     </w:p>
     <w:p>
@@ -8639,7 +8639,7 @@
           <w:i/>
           <w:sz w:val="26"/>
         </w:rPr>
-        <w:t>Trà Vinh, ngày . . . tháng . . . năm 20 . . .</w:t>
+        <w:t>TP. Hồ Chí Minh, ngày . . . tháng . . . năm 20 . . .</w:t>
       </w:r>
     </w:p>
     <w:sectPr>

</xml_diff>

<commit_message>
docs(de-cuong): muc 11 chi con o ky cua GVHD, dua dong ngay len tren
Bo cot "Sinh vien thuc hien" khoi bang ky ten, con mot cot duy nhat cho giang
vien huong dan. Dong "Ngay ... thang ... nam 20 ..." chuyen len tren bang.

O trong trong bang van cao toi thieu 1400 twip (~2.5cm) theo quy uoc san co
cua bo chuyen cho dong hoan toan rong, du cho de ky.

Van 16 trang, muc luc 25/25 dung.

Co-Authored-By: Claude Opus 5 <noreply@anthropic.com>
Claude-Session: https://claude.ai/code/session_01AEgUuwxWZb75UPoWigF6iK
</commit_message>
<xml_diff>
--- a/thesis/doc/de-cuong-do-an.docx
+++ b/thesis/doc/de-cuong-do-an.docx
@@ -8492,6 +8492,21 @@
         <w:t>...........................................................................</w:t>
       </w:r>
     </w:p>
+    <w:p>
+      <w:pPr>
+        <w:spacing w:lineRule="auto" w:line="360" w:before="120" w:after="120"/>
+        <w:jc w:val="both"/>
+      </w:pPr>
+      <w:r>
+        <w:rPr>
+          <w:rFonts w:ascii="Times New Roman" w:hAnsi="Times New Roman" w:cs="Times New Roman" w:eastAsia="Times New Roman"/>
+          <w:b w:val="0"/>
+          <w:i/>
+          <w:sz w:val="26"/>
+        </w:rPr>
+        <w:t>Ngày . . . tháng . . . năm 20 . . .</w:t>
+      </w:r>
+    </w:p>
     <w:tbl>
       <w:tblPr>
         <w:tblStyle w:val="TableGrid"/>
@@ -8501,8 +8516,7 @@
         <w:tblLook w:firstColumn="1" w:firstRow="1" w:lastColumn="0" w:lastRow="0" w:noHBand="0" w:noVBand="1" w:val="04A0"/>
       </w:tblPr>
       <w:tblGrid>
-        <w:gridCol w:w="4535"/>
-        <w:gridCol w:w="4535"/>
+        <w:gridCol w:w="9071"/>
       </w:tblGrid>
       <w:tr>
         <w:trPr>
@@ -8510,29 +8524,7 @@
         </w:trPr>
         <w:tc>
           <w:tcPr>
-            <w:tcW w:type="dxa" w:w="4535"/>
-            <w:shd w:val="clear" w:fill="EFEDE7"/>
-          </w:tcPr>
-          <w:p>
-            <w:pPr>
-              <w:spacing w:lineRule="auto" w:line="240" w:before="20" w:after="20"/>
-              <w:jc w:val="left"/>
-            </w:pPr>
-            <w:r/>
-            <w:r>
-              <w:rPr>
-                <w:rFonts w:ascii="Times New Roman" w:hAnsi="Times New Roman" w:cs="Times New Roman" w:eastAsia="Times New Roman"/>
-                <w:b/>
-                <w:i w:val="0"/>
-                <w:sz w:val="22"/>
-              </w:rPr>
-              <w:t>Sinh viên thực hiện</w:t>
-            </w:r>
-          </w:p>
-        </w:tc>
-        <w:tc>
-          <w:tcPr>
-            <w:tcW w:type="dxa" w:w="4535"/>
+            <w:tcW w:type="dxa" w:w="9071"/>
             <w:shd w:val="clear" w:fill="EFEDE7"/>
           </w:tcPr>
           <w:p>
@@ -8556,28 +8548,7 @@
       <w:tr>
         <w:tc>
           <w:tcPr>
-            <w:tcW w:type="dxa" w:w="4535"/>
-          </w:tcPr>
-          <w:p>
-            <w:pPr>
-              <w:spacing w:lineRule="auto" w:line="240" w:before="20" w:after="20"/>
-              <w:jc w:val="left"/>
-            </w:pPr>
-            <w:r/>
-            <w:r>
-              <w:rPr>
-                <w:rFonts w:ascii="Times New Roman" w:hAnsi="Times New Roman" w:cs="Times New Roman" w:eastAsia="Times New Roman"/>
-                <w:b w:val="0"/>
-                <w:i/>
-                <w:sz w:val="22"/>
-              </w:rPr>
-              <w:t>(Ký và ghi rõ họ tên)</w:t>
-            </w:r>
-          </w:p>
-        </w:tc>
-        <w:tc>
-          <w:tcPr>
-            <w:tcW w:type="dxa" w:w="4535"/>
+            <w:tcW w:type="dxa" w:w="9071"/>
           </w:tcPr>
           <w:p>
             <w:pPr>
@@ -8603,19 +8574,7 @@
         </w:trPr>
         <w:tc>
           <w:tcPr>
-            <w:tcW w:type="dxa" w:w="4535"/>
-          </w:tcPr>
-          <w:p>
-            <w:pPr>
-              <w:spacing w:lineRule="auto" w:line="240" w:before="20" w:after="20"/>
-              <w:jc w:val="left"/>
-            </w:pPr>
-            <w:r/>
-          </w:p>
-        </w:tc>
-        <w:tc>
-          <w:tcPr>
-            <w:tcW w:type="dxa" w:w="4535"/>
+            <w:tcW w:type="dxa" w:w="9071"/>
           </w:tcPr>
           <w:p>
             <w:pPr>
@@ -8627,21 +8586,6 @@
         </w:tc>
       </w:tr>
     </w:tbl>
-    <w:p>
-      <w:pPr>
-        <w:spacing w:lineRule="auto" w:line="360" w:before="120" w:after="120"/>
-        <w:jc w:val="both"/>
-      </w:pPr>
-      <w:r>
-        <w:rPr>
-          <w:rFonts w:ascii="Times New Roman" w:hAnsi="Times New Roman" w:cs="Times New Roman" w:eastAsia="Times New Roman"/>
-          <w:b w:val="0"/>
-          <w:i/>
-          <w:sz w:val="26"/>
-        </w:rPr>
-        <w:t>Ngày . . . tháng . . . năm 20 . . .</w:t>
-      </w:r>
-    </w:p>
     <w:sectPr>
       <w:headerReference w:type="default" r:id="rId10"/>
       <w:footerReference w:type="default" r:id="rId11"/>

</xml_diff>

<commit_message>
feat(xuat-ban): chi thi \phai cho doan can phai; muc 11 bo bang ky ten
Markdown khong co cu phap can phai. Them mot chi thi rieng, cung kieu voi
'\pagebreak' da co: dong bat dau bang '\phai ' ra mot doan can phai, van doc
duoc chu in dam va in nghieng trong do.

Muc 11 bo han bang ky ten. Ba dong ngay thang, chuc danh va "(Ky va ghi ro ho
ten)" gio la doan van can phai, khong vien, khong o nen xam. Cho ky la phan
giay trong con lai cua trang, khong can o cao co dinh nua.

Van 16 trang, muc luc 25/25 dung.

Co-Authored-By: Claude Opus 5 <noreply@anthropic.com>
Claude-Session: https://claude.ai/code/session_01AEgUuwxWZb75UPoWigF6iK
</commit_message>
<xml_diff>
--- a/thesis/doc/de-cuong-do-an.docx
+++ b/thesis/doc/de-cuong-do-an.docx
@@ -8494,8 +8494,8 @@
     </w:p>
     <w:p>
       <w:pPr>
-        <w:spacing w:lineRule="auto" w:line="360" w:before="120" w:after="120"/>
-        <w:jc w:val="both"/>
+        <w:spacing w:lineRule="auto" w:line="312" w:before="40" w:after="40"/>
+        <w:jc w:val="right"/>
       </w:pPr>
       <w:r>
         <w:rPr>
@@ -8507,85 +8507,36 @@
         <w:t>Ngày . . . tháng . . . năm 20 . . .</w:t>
       </w:r>
     </w:p>
-    <w:tbl>
-      <w:tblPr>
-        <w:tblStyle w:val="TableGrid"/>
-        <w:tblW w:type="auto" w:w="0"/>
-        <w:jc w:val="center"/>
-        <w:tblLayout w:type="autofit"/>
-        <w:tblLook w:firstColumn="1" w:firstRow="1" w:lastColumn="0" w:lastRow="0" w:noHBand="0" w:noVBand="1" w:val="04A0"/>
-      </w:tblPr>
-      <w:tblGrid>
-        <w:gridCol w:w="9071"/>
-      </w:tblGrid>
-      <w:tr>
-        <w:trPr>
-          <w:tblHeader w:val="true"/>
-        </w:trPr>
-        <w:tc>
-          <w:tcPr>
-            <w:tcW w:type="dxa" w:w="9071"/>
-            <w:shd w:val="clear" w:fill="EFEDE7"/>
-          </w:tcPr>
-          <w:p>
-            <w:pPr>
-              <w:spacing w:lineRule="auto" w:line="240" w:before="20" w:after="20"/>
-              <w:jc w:val="center"/>
-            </w:pPr>
-            <w:r/>
-            <w:r>
-              <w:rPr>
-                <w:rFonts w:ascii="Times New Roman" w:hAnsi="Times New Roman" w:cs="Times New Roman" w:eastAsia="Times New Roman"/>
-                <w:b/>
-                <w:i w:val="0"/>
-                <w:sz w:val="22"/>
-              </w:rPr>
-              <w:t>Giảng viên hướng dẫn</w:t>
-            </w:r>
-          </w:p>
-        </w:tc>
-      </w:tr>
-      <w:tr>
-        <w:tc>
-          <w:tcPr>
-            <w:tcW w:type="dxa" w:w="9071"/>
-          </w:tcPr>
-          <w:p>
-            <w:pPr>
-              <w:spacing w:lineRule="auto" w:line="240" w:before="20" w:after="20"/>
-              <w:jc w:val="center"/>
-            </w:pPr>
-            <w:r/>
-            <w:r>
-              <w:rPr>
-                <w:rFonts w:ascii="Times New Roman" w:hAnsi="Times New Roman" w:cs="Times New Roman" w:eastAsia="Times New Roman"/>
-                <w:b w:val="0"/>
-                <w:i/>
-                <w:sz w:val="22"/>
-              </w:rPr>
-              <w:t>(Ký và ghi rõ họ tên)</w:t>
-            </w:r>
-          </w:p>
-        </w:tc>
-      </w:tr>
-      <w:tr>
-        <w:trPr>
-          <w:trHeight w:val="1400" w:hRule="atLeast"/>
-        </w:trPr>
-        <w:tc>
-          <w:tcPr>
-            <w:tcW w:type="dxa" w:w="9071"/>
-          </w:tcPr>
-          <w:p>
-            <w:pPr>
-              <w:spacing w:lineRule="auto" w:line="240" w:before="20" w:after="20"/>
-              <w:jc w:val="center"/>
-            </w:pPr>
-            <w:r/>
-          </w:p>
-        </w:tc>
-      </w:tr>
-    </w:tbl>
+    <w:p>
+      <w:pPr>
+        <w:spacing w:lineRule="auto" w:line="312" w:before="40" w:after="40"/>
+        <w:jc w:val="right"/>
+      </w:pPr>
+      <w:r>
+        <w:rPr>
+          <w:rFonts w:ascii="Times New Roman" w:hAnsi="Times New Roman" w:cs="Times New Roman" w:eastAsia="Times New Roman"/>
+          <w:b/>
+          <w:i w:val="0"/>
+          <w:sz w:val="26"/>
+        </w:rPr>
+        <w:t>Giảng viên hướng dẫn</w:t>
+      </w:r>
+    </w:p>
+    <w:p>
+      <w:pPr>
+        <w:spacing w:lineRule="auto" w:line="312" w:before="40" w:after="40"/>
+        <w:jc w:val="right"/>
+      </w:pPr>
+      <w:r>
+        <w:rPr>
+          <w:rFonts w:ascii="Times New Roman" w:hAnsi="Times New Roman" w:cs="Times New Roman" w:eastAsia="Times New Roman"/>
+          <w:b w:val="0"/>
+          <w:i/>
+          <w:sz w:val="26"/>
+        </w:rPr>
+        <w:t>(Ký và ghi rõ họ tên)</w:t>
+      </w:r>
+    </w:p>
     <w:sectPr>
       <w:headerReference w:type="default" r:id="rId10"/>
       <w:footerReference w:type="default" r:id="rId11"/>

</xml_diff>

<commit_message>
fix(xuat-ban): khoi ky ten can giua voi nhau thay vi thang hang phai
Chi thi '\phai' can phai tung dong, nen chuc danh va dong "(Ky va ghi ro ho
ten)" ngan hon thi lech sang phai so voi dong ngay thang chu khong nam giua
no.

Doi thanh '\khoiky': thut le trai vao dung nua be ngang vung chu roi can giua
trong phan con lai. Ba dong vi the can giua VOI NHAU, va ca khoi van nam o
nua phai to giay.

Van 16 trang, muc luc 25/25 dung.

Co-Authored-By: Claude Opus 5 <noreply@anthropic.com>
Claude-Session: https://claude.ai/code/session_01AEgUuwxWZb75UPoWigF6iK
</commit_message>
<xml_diff>
--- a/thesis/doc/de-cuong-do-an.docx
+++ b/thesis/doc/de-cuong-do-an.docx
@@ -8495,7 +8495,8 @@
     <w:p>
       <w:pPr>
         <w:spacing w:lineRule="auto" w:line="312" w:before="40" w:after="40"/>
-        <w:jc w:val="right"/>
+        <w:ind w:left="4535"/>
+        <w:jc w:val="center"/>
       </w:pPr>
       <w:r>
         <w:rPr>
@@ -8510,7 +8511,8 @@
     <w:p>
       <w:pPr>
         <w:spacing w:lineRule="auto" w:line="312" w:before="40" w:after="40"/>
-        <w:jc w:val="right"/>
+        <w:ind w:left="4535"/>
+        <w:jc w:val="center"/>
       </w:pPr>
       <w:r>
         <w:rPr>
@@ -8525,7 +8527,8 @@
     <w:p>
       <w:pPr>
         <w:spacing w:lineRule="auto" w:line="312" w:before="40" w:after="40"/>
-        <w:jc w:val="right"/>
+        <w:ind w:left="4535"/>
+        <w:jc w:val="center"/>
       </w:pPr>
       <w:r>
         <w:rPr>

</xml_diff>

<commit_message>
fix(xuat-ban): dong ke muc 11 keo kin be chu bang tab dan dau cham
Chuoi dau cham la mot "tu" lien khoi nen can deu khong keo gian duoc: do
tren ban xuat chi dat 243,7pt tren 453,5pt be chu. Thay bang mot tab co
dan dau la dau cham, diem dung dat sat le phai — do lai duoc 451,7pt,
khong con phu thuoc so cham go trong Markdown hay co chu.

Co-Authored-By: Claude Opus 5 <noreply@anthropic.com>
Claude-Session: https://claude.ai/code/session_01AEgUuwxWZb75UPoWigF6iK
</commit_message>
<xml_diff>
--- a/thesis/doc/de-cuong-do-an.docx
+++ b/thesis/doc/de-cuong-do-an.docx
@@ -8404,6 +8404,9 @@
     </w:p>
     <w:p>
       <w:pPr>
+        <w:tabs>
+          <w:tab w:pos="9071" w:val="right" w:leader="dot"/>
+        </w:tabs>
         <w:spacing w:lineRule="auto" w:line="360" w:before="120" w:after="120"/>
         <w:jc w:val="both"/>
       </w:pPr>
@@ -8414,11 +8417,14 @@
           <w:i w:val="0"/>
           <w:sz w:val="26"/>
         </w:rPr>
-        <w:t>...........................................................................</w:t>
+        <w:tab/>
       </w:r>
     </w:p>
     <w:p>
       <w:pPr>
+        <w:tabs>
+          <w:tab w:pos="9071" w:val="right" w:leader="dot"/>
+        </w:tabs>
         <w:spacing w:lineRule="auto" w:line="360" w:before="120" w:after="120"/>
         <w:jc w:val="both"/>
       </w:pPr>
@@ -8429,11 +8435,14 @@
           <w:i w:val="0"/>
           <w:sz w:val="26"/>
         </w:rPr>
-        <w:t>...........................................................................</w:t>
+        <w:tab/>
       </w:r>
     </w:p>
     <w:p>
       <w:pPr>
+        <w:tabs>
+          <w:tab w:pos="9071" w:val="right" w:leader="dot"/>
+        </w:tabs>
         <w:spacing w:lineRule="auto" w:line="360" w:before="120" w:after="120"/>
         <w:jc w:val="both"/>
       </w:pPr>
@@ -8444,11 +8453,14 @@
           <w:i w:val="0"/>
           <w:sz w:val="26"/>
         </w:rPr>
-        <w:t>...........................................................................</w:t>
+        <w:tab/>
       </w:r>
     </w:p>
     <w:p>
       <w:pPr>
+        <w:tabs>
+          <w:tab w:pos="9071" w:val="right" w:leader="dot"/>
+        </w:tabs>
         <w:spacing w:lineRule="auto" w:line="360" w:before="120" w:after="120"/>
         <w:jc w:val="both"/>
       </w:pPr>
@@ -8459,11 +8471,14 @@
           <w:i w:val="0"/>
           <w:sz w:val="26"/>
         </w:rPr>
-        <w:t>...........................................................................</w:t>
+        <w:tab/>
       </w:r>
     </w:p>
     <w:p>
       <w:pPr>
+        <w:tabs>
+          <w:tab w:pos="9071" w:val="right" w:leader="dot"/>
+        </w:tabs>
         <w:spacing w:lineRule="auto" w:line="360" w:before="120" w:after="120"/>
         <w:jc w:val="both"/>
       </w:pPr>
@@ -8474,11 +8489,14 @@
           <w:i w:val="0"/>
           <w:sz w:val="26"/>
         </w:rPr>
-        <w:t>...........................................................................</w:t>
+        <w:tab/>
       </w:r>
     </w:p>
     <w:p>
       <w:pPr>
+        <w:tabs>
+          <w:tab w:pos="9071" w:val="right" w:leader="dot"/>
+        </w:tabs>
         <w:spacing w:lineRule="auto" w:line="360" w:before="120" w:after="120"/>
         <w:jc w:val="both"/>
       </w:pPr>
@@ -8489,7 +8507,7 @@
           <w:i w:val="0"/>
           <w:sz w:val="26"/>
         </w:rPr>
-        <w:t>...........................................................................</w:t>
+        <w:tab/>
       </w:r>
     </w:p>
     <w:p>

</xml_diff>